<commit_message>
Final QA pass: content gaps, formatting, and PDF print fixes
Content fixes:
- 11-filled-example.docx: now has 5 tables (physical supply, monetary
  supply, physical use, monetary use, integrated SUT)
- Exercise workbook README: added Step 7 (SUT) explanation
- Answers sheet: SUT answers included

Formatting QA:
- Ran format_qa.py on all 51 Word docs across all 8 notebooks
- Checked for: ** markdown artifacts, orphaned titles, table widths,
  consecutive blanks, font consistency
- Result: 51 files checked, 0 issues found (clean)

PDF print fixes:
- Injected @media print CSS into all 21 HTML visual slides:
  @page { size: A4 landscape; margin: 10mm }
  Content scales to fit, no cutoff, shadows removed for print
- Regenerated all 16 PDFs with Chrome headless
- Updated all notebook PDF copies

All print-notebooks/03-services/ files now verified:
  Supply: all 15 files YES
  Use: all 15 files YES
  SUT: all 15 files YES

Co-Authored-By: Claude Opus 4.6 (1M context) <noreply@anthropic.com>
</commit_message>
<xml_diff>
--- a/s-s-event-bogor/print-notebooks/00-overview/03-triage-card.docx
+++ b/s-s-event-bogor/print-notebooks/00-overview/03-triage-card.docx
@@ -11,7 +11,7 @@
           <w:rFonts w:ascii="Arial" w:hAnsi="Arial"/>
           <w:b w:val="0"/>
           <w:color w:val="0A5455"/>
-          <w:sz w:val="32"/>
+          <w:sz w:val="20"/>
         </w:rPr>
         <w:t>Ocean Accounting Clinic -- Facilitator Triage Card</w:t>
       </w:r>
@@ -22,7 +22,7 @@
           <w:rFonts w:ascii="Arial" w:hAnsi="Arial"/>
           <w:b w:val="0"/>
           <w:color w:val="3B9C7B"/>
-          <w:sz w:val="22"/>
+          <w:sz w:val="20"/>
         </w:rPr>
         <w:t>S-S Ocean Accounting Exchange 2026, Bogor</w:t>
       </w:r>
@@ -33,7 +33,7 @@
           <w:rFonts w:ascii="Arial" w:hAnsi="Arial"/>
           <w:b w:val="0"/>
           <w:color w:val="0A5455"/>
-          <w:sz w:val="28"/>
+          <w:sz w:val="20"/>
         </w:rPr>
         <w:t>Step 1: Ask three questions</w:t>
       </w:r>
@@ -72,12 +72,15 @@
       </w:r>
     </w:p>
     <w:p>
+      <w:pPr>
+        <w:keepNext/>
+      </w:pPr>
       <w:r>
         <w:rPr>
           <w:rFonts w:ascii="Arial" w:hAnsi="Arial"/>
           <w:b w:val="0"/>
           <w:color w:val="0A5455"/>
-          <w:sz w:val="28"/>
+          <w:sz w:val="20"/>
         </w:rPr>
         <w:t>Step 2: Direct to the right pathway</w:t>
       </w:r>
@@ -696,7 +699,7 @@
           <w:rFonts w:ascii="Arial" w:hAnsi="Arial"/>
           <w:b w:val="0"/>
           <w:color w:val="0A5455"/>
-          <w:sz w:val="28"/>
+          <w:sz w:val="20"/>
         </w:rPr>
         <w:t>Step 3: Walk through with them</w:t>
       </w:r>
@@ -746,12 +749,15 @@
       </w:r>
     </w:p>
     <w:p>
+      <w:pPr>
+        <w:keepNext/>
+      </w:pPr>
       <w:r>
         <w:rPr>
           <w:rFonts w:ascii="Arial" w:hAnsi="Arial"/>
           <w:b w:val="0"/>
           <w:color w:val="0A5455"/>
-          <w:sz w:val="28"/>
+          <w:sz w:val="20"/>
         </w:rPr>
         <w:t>Facilitator specializations</w:t>
       </w:r>
@@ -1009,7 +1015,7 @@
           <w:rFonts w:ascii="Arial" w:hAnsi="Arial"/>
           <w:b w:val="0"/>
           <w:color w:val="0A5455"/>
-          <w:sz w:val="28"/>
+          <w:sz w:val="20"/>
         </w:rPr>
         <w:t>Key reminders</w:t>
       </w:r>

</xml_diff>